<commit_message>
Rewrite Doc 1 after line-edit and comment pass
Thomas deleted a set of sentences and left eleven comments identifying
AI-writing patterns beyond the earlier addressed-to-Karl issue: preview
sentences, redundant closing summaries, internal tracking language
leaking into reader-facing prose, meta-citation instructions, abstract
personifying rhetoric, and unexplained jargon. Rewrote applying all of
these; two open questions on scope flagged rather than resolved
unilaterally, not yet applied to Docs 2-5.

Co-Authored-By: Claude Sonnet 5 <noreply@anthropic.com>
Claude-Session: https://claude.ai/code/session_01T6UzmRkyqYD2WcKRzWtaQa
</commit_message>
<xml_diff>
--- a/40_DOCS/Doc_1_Circularity_and_Game_Value.docx
+++ b/40_DOCS/Doc_1_Circularity_and_Game_Value.docx
@@ -17,25 +17,25 @@
         <w:jc w:val="left"/>
       </w:pPr>
       <w:r>
-        <w:t xml:space="preserve">This document explains the model's dollar-per-win conversion rate and the independent check built to test it for circularity. The rate that converts a projected win total into dollars is fitted from the same WAR figures the model prices players on, so a check built only from those figures would only show that the model agrees with itself. Game Value is the independent measure built to break that dependency: what it is, why it does not replace the model's primary value source, and what its results do and do not prove.</w:t>
-      </w:r>
-    </w:p>
-    <w:p>
-      <w:pPr>
-        <w:pStyle w:val="Heading2"/>
-        <w:spacing w:after="140" w:before="280"/>
-      </w:pPr>
-      <w:r>
-        <w:t xml:space="preserve">The problem, stated before the solution</w:t>
-      </w:r>
-    </w:p>
-    <w:p>
-      <w:pPr>
-        <w:spacing w:after="200"/>
-        <w:jc w:val="left"/>
-      </w:pPr>
-      <w:r>
-        <w:t xml:space="preserve">Each player's dollar value in this model starts from a projected win total, and the rate that converts wins to dollars is fitted on contracts whose market price already reflects Bacon's WAR. If the only available check on "does this projection look right" is also built from Bacon, the check always passes by construction. This is testing the model's own arithmetic, not reality. An outside measure was needed, something that predicts on-ice value without touching Bacon anywhere in its construction, so that agreement between the two would mean something.</w:t>
+        <w:t xml:space="preserve">This document explains the model's dollar-per-win conversion rate and the independent check built to test it for circularity. The rate that converts wins into dollars comes from real player contracts, priced using the same WAR numbers the model uses to value those players. A check built only from those same numbers would only prove the model agrees with itself. Game Value is the independent measure built to break that dependency.</w:t>
+      </w:r>
+    </w:p>
+    <w:p>
+      <w:pPr>
+        <w:pStyle w:val="Heading2"/>
+        <w:spacing w:after="140" w:before="280"/>
+      </w:pPr>
+      <w:r>
+        <w:t xml:space="preserve">The problem</w:t>
+      </w:r>
+    </w:p>
+    <w:p>
+      <w:pPr>
+        <w:spacing w:after="200"/>
+        <w:jc w:val="left"/>
+      </w:pPr>
+      <w:r>
+        <w:t xml:space="preserve">Each player's dollar value in this model starts from a projected win total. The rate that turns those wins into dollars comes from real player contracts, and those contract prices already reflect Bacon's WAR. If the only available check on whether a projection looks right is also built from Bacon, the check always passes automatically, because it is comparing the model to itself. An outside measure was needed: something that predicts on-ice value without touching Bacon anywhere in its construction, so that agreement between the two would actually mean something.</w:t>
       </w:r>
     </w:p>
     <w:p>
@@ -53,115 +53,70 @@
         <w:jc w:val="left"/>
       </w:pPr>
       <w:r>
-        <w:t xml:space="preserve">Game Value is a second, independent measure of on-ice contribution, built from raw play-by-play data with zero Bacon inputs at any stage. It assigns credit for each goal for and against to the skaters on the ice at the time, using a fixed accounting identity, which is an equal split among the players actually on the ice, plus league-estimated adjustment factors for strength state and score state, never a model fitted to Bacon. That independence is the entire point of building it, a measure that shares no model and no data source with the number it is meant to check.</w:t>
-      </w:r>
-    </w:p>
-    <w:p>
-      <w:pPr>
-        <w:spacing w:after="200"/>
-        <w:jc w:val="left"/>
-      </w:pPr>
-      <w:r>
-        <w:t xml:space="preserve">The metric is built and validated end to end on 11,870 games, from 2017-18 through 2025-26. Its accounting identity holds exactly (a discrepancy of 0.000000 across the full dataset), and it explains 58.3% of team-season goal differential (R²=0.583, slope 1.085) despite being fitted to nothing. At the single-game level it explains only 3.4% of variance, which sounds low until it is set against a public benchmark: MoneyPuck's model, built with far richer features, explains roughly 7% per game. A single game is mostly luck for any model, and Game Value is honestly benchmarked against one that has more to work with.</w:t>
-      </w:r>
-    </w:p>
-    <w:p>
-      <w:pPr>
-        <w:spacing w:after="200"/>
-        <w:jc w:val="left"/>
-      </w:pPr>
-      <w:r>
-        <w:t xml:space="preserve">Game Value cannot separate a player from his own linemates. An equal split assigns identical credit to everyone on the ice together, so it cannot tell a driver of a shift from a passenger on it. This is why it is scoped to allocation and validation rather than used as a standalone player value.</w:t>
-      </w:r>
-    </w:p>
-    <w:p>
-      <w:pPr>
-        <w:pStyle w:val="Heading2"/>
-        <w:spacing w:after="140" w:before="280"/>
-      </w:pPr>
-      <w:r>
-        <w:t xml:space="preserve">The replacement test, and why it failed</w:t>
-      </w:r>
-    </w:p>
-    <w:p>
-      <w:pPr>
-        <w:spacing w:after="200"/>
-        <w:jc w:val="left"/>
-      </w:pPr>
-      <w:r>
-        <w:t xml:space="preserve">Before Game Value was scoped to its current, narrower roles, a pre-registered four-test battery asked a bigger question: could an adjusted version of Game Value (GV-adj, with RAPM-style teammate and competition separation, shrunken finishing talent, and deployment controls) replace Bacon WAR for skater valuation outright. The answer was no, and the reason is structural rather than a tuning problem.</w:t>
-      </w:r>
-    </w:p>
-    <w:p>
-      <w:pPr>
-        <w:spacing w:after="200"/>
-        <w:jc w:val="left"/>
-      </w:pPr>
-      <w:r>
-        <w:t xml:space="preserve">For forwards, GV-adj recovered a substantial share of Bacon's explanatory power: R²=0.504 against Bacon's own 0.612. For defencemen, it did not: R²=0.012 against Bacon's 0.281–0.295. Defensive value is disproportionately about preventing events from happening, and shot-and-shift data has very little to say about what a defenceman prevents. No amount of retuning closes that gap, because the data does not contain the signal.</w:t>
-      </w:r>
-    </w:p>
-    <w:p>
-      <w:pPr>
-        <w:pStyle w:val="Heading2"/>
-        <w:spacing w:after="140" w:before="280"/>
-      </w:pPr>
-      <w:r>
-        <w:t xml:space="preserve">Game Value's three jobs, and nothing else</w:t>
-      </w:r>
-    </w:p>
-    <w:p>
-      <w:pPr>
-        <w:spacing w:after="200"/>
-        <w:jc w:val="left"/>
-      </w:pPr>
-      <w:r>
-        <w:t xml:space="preserve">Once the replacement test closed, Game Value was locked into three scoped roles, and no others:</w:t>
-      </w:r>
-    </w:p>
-    <w:p>
-      <w:pPr>
-        <w:spacing w:after="200"/>
-        <w:jc w:val="left"/>
-      </w:pPr>
-      <w:r>
-        <w:t xml:space="preserve">Mid-season allocation. Bacon supplies a player's season-long value; Game Value's per-game breakdown is used only to split that season total across the games a traded player spent with each team.</w:t>
-      </w:r>
-    </w:p>
-    <w:p>
-      <w:pPr>
-        <w:spacing w:after="200"/>
-        <w:jc w:val="left"/>
-      </w:pPr>
-      <w:r>
-        <w:t xml:space="preserve">Two circularity validators. GV-adj as the primary check and GV-raw (the same metric without the RAPM adjustment) as a robustness leg, both described below.</w:t>
-      </w:r>
-    </w:p>
-    <w:p>
-      <w:pPr>
-        <w:spacing w:after="200"/>
-        <w:jc w:val="left"/>
-      </w:pPr>
-      <w:r>
-        <w:t xml:space="preserve">Bacon remains the sole source of skater value levels. Game Value never enters a valuation directly. This keeps single-provider discipline intact rather than loosening it, since the two measures now do different, non-overlapping jobs.</w:t>
-      </w:r>
-    </w:p>
-    <w:p>
-      <w:pPr>
-        <w:pStyle w:val="Heading2"/>
-        <w:spacing w:after="140" w:before="280"/>
-      </w:pPr>
-      <w:r>
-        <w:t xml:space="preserve">The mid-season allocation problem</w:t>
-      </w:r>
-    </w:p>
-    <w:p>
-      <w:pPr>
-        <w:spacing w:after="200"/>
-        <w:jc w:val="left"/>
-      </w:pPr>
-      <w:r>
-        <w:t xml:space="preserve">A player traded partway through a season has one cumulative Bacon WAR figure for the full year, and the model needs to know how much of that value belonged to each team he played for. Prorating by games played treats every game as equally valuable, and that is not true; a player can be far more productive in one stretch of a season than another. Game Value's per-game numbers, tagged by team, are used to weight the split instead: a team gets the share of the season's Game Value that its games actually produced, and Bacon's season total is divided in that proportion. This is the allocation use, and it does not touch the circularity question.</w:t>
+        <w:t xml:space="preserve">Game Value is a second, independent measure of on-ice contribution, built from raw play-by-play data with zero Bacon inputs at any stage. For each goal scored, it splits credit equally among the players who were on the ice for it, then adjusts that credit for the game situation: strength state, meaning whether a team was at even strength, on the power play, or shorthanded, and score state, meaning whether a team was leading, trailing, or tied, since teams play differently in each situation.</w:t>
+      </w:r>
+    </w:p>
+    <w:p>
+      <w:pPr>
+        <w:spacing w:after="200"/>
+        <w:jc w:val="left"/>
+      </w:pPr>
+      <w:r>
+        <w:t xml:space="preserve">The metric is built and validated on 11,870 games, from 2017-18 through 2025-26. It explains 58.3% of the actual difference in goals scored between teams over a season, despite never being fitted to match anything. At the single-game level it explains only 3.4% of what happens in that one game, which sounds low until it is compared to a public benchmark: MoneyPuck, a reputable advanced hockey-analytics website, explains roughly 7% per game with a far more detailed model. A single game is mostly luck for any model.</w:t>
+      </w:r>
+    </w:p>
+    <w:p>
+      <w:pPr>
+        <w:spacing w:after="200"/>
+        <w:jc w:val="left"/>
+      </w:pPr>
+      <w:r>
+        <w:t xml:space="preserve">Game Value cannot tell a player apart from his own linemates: an equal split gives everyone on the ice the same credit, so it cannot separate a player who drove a shift from one who was just along for it. This is why Game Value is used for allocation and validation rather than as a standalone player value.</w:t>
+      </w:r>
+    </w:p>
+    <w:p>
+      <w:pPr>
+        <w:pStyle w:val="Heading2"/>
+        <w:spacing w:after="140" w:before="280"/>
+      </w:pPr>
+      <w:r>
+        <w:t xml:space="preserve">Why use Bacon's WAR over Game Value?</w:t>
+      </w:r>
+    </w:p>
+    <w:p>
+      <w:pPr>
+        <w:spacing w:after="200"/>
+        <w:jc w:val="left"/>
+      </w:pPr>
+      <w:r>
+        <w:t xml:space="preserve">Before Game Value was scoped to its current, narrower roles, a test asked a bigger question: could an adjusted version of Game Value replace Bacon's WAR for valuing skaters outright. That adjusted version, called GV-adj, tries to isolate an individual player's contribution more precisely than the raw split above: it separates a player's performance from his teammates and the opponents he faced, discounts finishing ability that looks more like luck than skill, and accounts for how a coach deploys him, offensive minutes against defensive minutes, for example.</w:t>
+      </w:r>
+    </w:p>
+    <w:p>
+      <w:pPr>
+        <w:spacing w:after="200"/>
+        <w:jc w:val="left"/>
+      </w:pPr>
+      <w:r>
+        <w:t xml:space="preserve">For forwards, GV-adj recovered a substantial share of Bacon's explanatory power. For defencemen, it did not. Defensive value is disproportionately about preventing events from happening in the first place, and play-by-play data has very little to say about what a defenceman prevented, since a good defensive play often just looks like nothing happening at all.</w:t>
+      </w:r>
+    </w:p>
+    <w:p>
+      <w:pPr>
+        <w:pStyle w:val="Heading2"/>
+        <w:spacing w:after="140" w:before="280"/>
+      </w:pPr>
+      <w:r>
+        <w:t xml:space="preserve">Mid-season allocation</w:t>
+      </w:r>
+    </w:p>
+    <w:p>
+      <w:pPr>
+        <w:spacing w:after="200"/>
+        <w:jc w:val="left"/>
+      </w:pPr>
+      <w:r>
+        <w:t xml:space="preserve">Bacon supplies a player's season-long value; Game Value's per-game breakdown is used only to split that season total between the teams a traded player played for. A player traded partway through a season has one cumulative Bacon WAR figure for the full year, and the model needs to know how much of that value belonged to each team. Splitting by games played would treat every game as equally valuable, and that is not true: a player can be far more productive in one stretch of a season than another. Game Value's per-game numbers, tagged by team, are used to weight the split instead: a team gets the share of the season's Game Value that its games actually produced, and Bacon's season total is divided in that proportion. Bacon remains the sole source of skater value levels; Game Value is only ever used to divide an existing Bacon total, never to set one.</w:t>
       </w:r>
     </w:p>
     <w:p>
@@ -179,54 +134,25 @@
         <w:jc w:val="left"/>
       </w:pPr>
       <w:r>
-        <w:t xml:space="preserve">The primary validator, GV-adj, was run on 6,027 player-seasons: </w:t>
-      </w:r>
-      <w:r>
-        <w:rPr>
-          <w:i/>
-          <w:iCs/>
-        </w:rPr>
-        <w:t xml:space="preserve">trailing_war(t)</w:t>
-      </w:r>
-      <w:r>
-        <w:t xml:space="preserve">, the exact ex-ante quantity the model prices, against same-season GV-adj, both in win units, with no dollar conversion on either side. The result was r=0.576 (Spearman 0.460, OLS R²=0.331), and it held across each of the nine seasons in the sample, r=0.55–0.61 in every one, so no single season and no era break is carrying the result. A one-year-ahead version, testing </w:t>
-      </w:r>
-      <w:r>
-        <w:rPr>
-          <w:i/>
-          <w:iCs/>
-        </w:rPr>
-        <w:t xml:space="preserve">trailing_war(t)</w:t>
-      </w:r>
-      <w:r>
-        <w:t xml:space="preserve"> against GV-adj at t+1, held nearly as well at r=0.538.</w:t>
-      </w:r>
-    </w:p>
-    <w:p>
-      <w:pPr>
-        <w:spacing w:after="200"/>
-        <w:jc w:val="left"/>
-      </w:pPr>
-      <w:r>
-        <w:t xml:space="preserve">A robustness leg followed using GV-raw, the same metric without the RAPM adjustment, in two variants: rebased against replacement level (r=0.609) and zero-sum (r=0.564). All three validators land in a tight 0.56–0.61 band, stable across all nine seasons, with the same gentle decay at the one-year-ahead horizon. One interpretive note worth keeping: GV-raw matches or slightly exceeds GV-adj, most likely because the RAPM adjustment strips out team-context signal that Bacon WAR also carries. This is a finding about what each metric measures, not a reason to revisit GV-adj as the primary validator.</w:t>
-      </w:r>
-    </w:p>
-    <w:p>
-      <w:pPr>
-        <w:spacing w:after="200"/>
-        <w:jc w:val="left"/>
-      </w:pPr>
-      <w:r>
-        <w:t xml:space="preserve">The forward and defence numbers split the same way the replacement test predicted: r=0.648 for forwards, r=0.302 for defencemen. This is the same defensive-data wall seen from the outcome side rather than the input side, and it means the circularity check is strong for forwards and comparatively weak for defencemen. Anywhere this result gets cited, that split should be cited alongside it.</w:t>
-      </w:r>
-    </w:p>
-    <w:p>
-      <w:pPr>
-        <w:spacing w:after="200"/>
-        <w:jc w:val="left"/>
-      </w:pPr>
-      <w:r>
-        <w:t xml:space="preserve">Because of this result, the internal severity rating on this item was downgraded from Fatal to Important on 2026-07-04, once the validator design was locked, and the item was marked resolved with stated limitations once the primary and robustness legs both ran on 2026-07-14.</w:t>
+        <w:t xml:space="preserve">The main test compares each player's trailing production figure, the same number the model prices him on, against how he actually performed that season according to the adjusted version of Game Value. Both sides are measured in wins, with no dollar conversion involved. Run across 6,027 player-seasons, the two measures agreed at a correlation of 0.576, and that held steady across each of the nine seasons in the sample: no single season and no shift in the league's style of play is driving the result. Testing the same comparison a year further out, projecting a player's production and checking it against his Game Value the following season, the agreement held nearly as well.</w:t>
+      </w:r>
+    </w:p>
+    <w:p>
+      <w:pPr>
+        <w:spacing w:after="200"/>
+        <w:jc w:val="left"/>
+      </w:pPr>
+      <w:r>
+        <w:t xml:space="preserve">A second version of the test used Game Value without the adjustment described above, scored two different ways: against a replacement-level baseline, meaning how much better a player was than a freely available replacement, and as a zero-sum split, meaning a team's whole output is divided up among its players with nothing left over. Both versions came out close to the main result, in the same 0.56 to 0.61 range, and held up the same way across all nine seasons and at the one-year-out horizon, weakening only slightly the further out the comparison reached. One thing worth flagging: the unadjusted version of Game Value matched or slightly beat the adjusted version. That is likely because the adjustment strips out some of the team-context signal described above, so removing it made the two measures look more alike, not less.</w:t>
+      </w:r>
+    </w:p>
+    <w:p>
+      <w:pPr>
+        <w:spacing w:after="200"/>
+        <w:jc w:val="left"/>
+      </w:pPr>
+      <w:r>
+        <w:t xml:space="preserve">The agreement splits by position the same way the earlier test did: strong for forwards, much weaker for defencemen. This is the same defensive-data gap described above, showing up again from the outcome side rather than the input side.</w:t>
       </w:r>
     </w:p>
     <w:p>
@@ -244,34 +170,16 @@
         <w:jc w:val="left"/>
       </w:pPr>
       <w:r>
-        <w:t xml:space="preserve">Three limitations are load-bearing here and belong wherever this result is cited, not left implicit.</w:t>
-      </w:r>
-    </w:p>
-    <w:p>
-      <w:pPr>
-        <w:spacing w:after="200"/>
-        <w:jc w:val="left"/>
-      </w:pPr>
-      <w:r>
-        <w:t xml:space="preserve">First, this is convergent validity, not confirmation that the dollar value of a win is correct. The test runs entirely in win units and can only show that the projection tracks an independent measure of the same underlying performance. It says nothing about whether the market rate that turns those wins into dollars (Doc 3, §3.2) is the right rate.</w:t>
-      </w:r>
-    </w:p>
-    <w:p>
-      <w:pPr>
-        <w:spacing w:after="200"/>
-        <w:jc w:val="left"/>
-      </w:pPr>
-      <w:r>
-        <w:t xml:space="preserve">Second, no pass/fail threshold was pre-registered before the test ran, and one was not retrofitted afterward once the result was in. An r of 0.576 is being reported and interpreted, not scored against a bar that was set in advance, because no such bar was set. Retrofitting one now would be choosing the answer after seeing the data, and that was explicitly rejected as an option.</w:t>
-      </w:r>
-    </w:p>
-    <w:p>
-      <w:pPr>
-        <w:spacing w:after="200"/>
-        <w:jc w:val="left"/>
-      </w:pPr>
-      <w:r>
-        <w:t xml:space="preserve">Third, and this is the caveat a careful reader will reach for on their own: Bacon WAR and Game Value share no model and no data source, but they describe the same underlying games. Two measures that never touch each other computationally can still agree in part because reality constrains what either of them can say. The honest claim is no shared model or vendor, not no shared reality, and that distinction should be stated before a reader raises it.</w:t>
+        <w:t xml:space="preserve">This is convergent validity, not confirmation that the dollar value of a win is correct. Convergent validity means two independently built measures point in the same direction, which is different from proving either one is right. This test can only show that the model's projection tracks an independent measure of the same underlying performance. It says nothing about whether the market rate that turns wins into dollars is itself the correct rate.</w:t>
+      </w:r>
+    </w:p>
+    <w:p>
+      <w:pPr>
+        <w:spacing w:after="200"/>
+        <w:jc w:val="left"/>
+      </w:pPr>
+      <w:r>
+        <w:t xml:space="preserve">Bacon's WAR and Game Value share no model and no data source, but they describe the same underlying games. Two measures built completely separately can still agree in part simply because they are both trying to describe the same reality. The two are independent in method, not in what they are measuring.</w:t>
       </w:r>
     </w:p>
     <w:p>
@@ -289,16 +197,16 @@
         <w:jc w:val="left"/>
       </w:pPr>
       <w:r>
-        <w:t xml:space="preserve">The forward/defence split repeats the known defensive-data weakness on the outcome side of the check (F 0.648, D 0.302). The honest defence range to quote anywhere is 0.28–0.30, not the forward number.</w:t>
-      </w:r>
-    </w:p>
-    <w:p>
-      <w:pPr>
-        <w:spacing w:after="200"/>
-        <w:jc w:val="left"/>
-      </w:pPr>
-      <w:r>
-        <w:t xml:space="preserve">One pre-specified robustness leg was never run: two additional raw-GV variants that were part of the original test plan. This is recorded here so it reads as a deliberate scope decision rather than something that was missed.</w:t>
+        <w:t xml:space="preserve">The gap between forwards and defencemen shows up on both sides of this check: Game Value explains skater value less well for defencemen to begin with, and the agreement in this test is weaker for defencemen too. Any number pulled from this check for defencemen should sit in the 0.28 to 0.30 range, not the higher forward number.</w:t>
+      </w:r>
+    </w:p>
+    <w:p>
+      <w:pPr>
+        <w:spacing w:after="200"/>
+        <w:jc w:val="left"/>
+      </w:pPr>
+      <w:r>
+        <w:t xml:space="preserve">One planned extra check, testing two additional variants of the unadjusted Game Value, was never run. That is a deliberate scope decision, not something that was missed.</w:t>
       </w:r>
     </w:p>
     <w:sectPr>

</xml_diff>

<commit_message>
Revise Doc 1 again after a substantive comment pass
This round's comments were comprehension gaps, not voice complaints:
trailing/projected production were used throughout without being
defined, the Game Value explanation had lost "goals for and against"
in an earlier trim and never explained why the goal-differential check
isn't circular, and the document never justified using Game Value over
a simple points split for mid-season allocation. Added real
explanation for all three rather than trimming further.

The "Open and untested" section was deleted again with no comment,
second time in a row - treated as confirmed intent, removed, and its
content folded into the flowing prose instead. Scoped to Doc 1 only
per instruction; not applied to Docs 2-5 or the plan's Coverage Rule.

Co-Authored-By: Claude Sonnet 5 <noreply@anthropic.com>
Claude-Session: https://claude.ai/code/session_01T6UzmRkyqYD2WcKRzWtaQa
</commit_message>
<xml_diff>
--- a/40_DOCS/Doc_1_Circularity_and_Game_Value.docx
+++ b/40_DOCS/Doc_1_Circularity_and_Game_Value.docx
@@ -17,7 +17,7 @@
         <w:jc w:val="left"/>
       </w:pPr>
       <w:r>
-        <w:t xml:space="preserve">This document explains the model's dollar-per-win conversion rate and the independent check built to test it for circularity. The rate that converts wins into dollars comes from real player contracts, priced using the same WAR numbers the model uses to value those players. A check built only from those same numbers would only prove the model agrees with itself. Game Value is the independent measure built to break that dependency.</w:t>
+        <w:t xml:space="preserve">This document explains the independent check built to test the model's dollar-per-win conversion rate for circularity. That rate, covered in the pricing document, is built from real player contracts, priced using the same WAR numbers the model uses to value those players. A check built only from those same numbers would only prove the model agrees with itself. Game Value is the independent measure built to break that dependency.</w:t>
       </w:r>
     </w:p>
     <w:p>
@@ -40,6 +40,15 @@
     </w:p>
     <w:p>
       <w:pPr>
+        <w:spacing w:after="200"/>
+        <w:jc w:val="left"/>
+      </w:pPr>
+      <w:r>
+        <w:t xml:space="preserve">Two terms recur through the rest of this document, and it is worth being precise about them here. A player's trailing production is his trailing WAR: a weighted blend of his Bacon WAR from the seasons before the date being valued, covered in the baseline document. A player's projected production, used for future contract seasons, takes that trailing figure and runs it forward through an aging curve, covered in the projection document. The market-rate regression is what actually converts a player's trailing WAR into a dollar figure; that regression, not the trailing WAR itself, is the rate mentioned above, and it is built in the pricing document, not here.</w:t>
+      </w:r>
+    </w:p>
+    <w:p>
+      <w:pPr>
         <w:pStyle w:val="Heading2"/>
         <w:spacing w:after="140" w:before="280"/>
       </w:pPr>
@@ -53,16 +62,16 @@
         <w:jc w:val="left"/>
       </w:pPr>
       <w:r>
-        <w:t xml:space="preserve">Game Value is a second, independent measure of on-ice contribution, built from raw play-by-play data with zero Bacon inputs at any stage. For each goal scored, it splits credit equally among the players who were on the ice for it, then adjusts that credit for the game situation: strength state, meaning whether a team was at even strength, on the power play, or shorthanded, and score state, meaning whether a team was leading, trailing, or tied, since teams play differently in each situation.</w:t>
-      </w:r>
-    </w:p>
-    <w:p>
-      <w:pPr>
-        <w:spacing w:after="200"/>
-        <w:jc w:val="left"/>
-      </w:pPr>
-      <w:r>
-        <w:t xml:space="preserve">The metric is built and validated on 11,870 games, from 2017-18 through 2025-26. It explains 58.3% of the actual difference in goals scored between teams over a season, despite never being fitted to match anything. At the single-game level it explains only 3.4% of what happens in that one game, which sounds low until it is compared to a public benchmark: MoneyPuck, a reputable advanced hockey-analytics website, explains roughly 7% per game with a far more detailed model. A single game is mostly luck for any model.</w:t>
+        <w:t xml:space="preserve">Game Value is a second, independent measure of on-ice contribution, built from raw play-by-play data with zero Bacon inputs at any stage. For each goal, it splits credit for it, positive for the team that scored and negative for the team that allowed it, equally among the players who were on the ice, then adjusts that credit for the game situation: strength state, meaning whether a team was at even strength, on the power play, or shorthanded, and score state, meaning whether a team was leading, trailing, or tied, since teams play differently in each situation.</w:t>
+      </w:r>
+    </w:p>
+    <w:p>
+      <w:pPr>
+        <w:spacing w:after="200"/>
+        <w:jc w:val="left"/>
+      </w:pPr>
+      <w:r>
+        <w:t xml:space="preserve">The metric is built and validated on 11,870 games, from 2017-18 through 2025-26, and it is checked two different ways that answer two different questions. First, within any single game, the credit assigned to every player on the ice sums back exactly to that game's own goals for and against, with zero discrepancy across the full dataset. That is a bookkeeping check: it confirms the redistribution math has no bugs, not that the metric measures anything useful. Second, because the strength-state and score-state adjustments are estimated weights rather than a plain equal split, a team's Game Value added up across a full season does not have to match that team's actual season-long goal differential; small errors in those weights could compound across 82 games. Checking the two against each other is a real outside test of whether the weights are reasonable, and that check explains 58.3% of the actual variation in real goal differential across team-seasons. At the single-game level it explains only 3.4% of what happens in that one game, which sounds low until it is compared to a public benchmark: MoneyPuck, a reputable advanced hockey-analytics website, explains roughly 7% per game with a far more detailed model. A single game is mostly luck for any model.</w:t>
       </w:r>
     </w:p>
     <w:p>
@@ -116,7 +125,25 @@
         <w:jc w:val="left"/>
       </w:pPr>
       <w:r>
-        <w:t xml:space="preserve">Bacon supplies a player's season-long value; Game Value's per-game breakdown is used only to split that season total between the teams a traded player played for. A player traded partway through a season has one cumulative Bacon WAR figure for the full year, and the model needs to know how much of that value belonged to each team. Splitting by games played would treat every game as equally valuable, and that is not true: a player can be far more productive in one stretch of a season than another. Game Value's per-game numbers, tagged by team, are used to weight the split instead: a team gets the share of the season's Game Value that its games actually produced, and Bacon's season total is divided in that proportion. Bacon remains the sole source of skater value levels; Game Value is only ever used to divide an existing Bacon total, never to set one.</w:t>
+        <w:t xml:space="preserve">A player traded partway through a season has one cumulative Bacon WAR figure for the full year, and the model needs to know how much of that value belonged to each team. Splitting by games played would treat every game as equally valuable, and that is not true: a player can be far more productive in one stretch of a season than another.</w:t>
+      </w:r>
+    </w:p>
+    <w:p>
+      <w:pPr>
+        <w:spacing w:after="200"/>
+        <w:jc w:val="left"/>
+      </w:pPr>
+      <w:r>
+        <w:t xml:space="preserve">Points could be used instead, since the data already shows which games a player's points came from, but points would misallocate this specific number. Bacon's WAR is not just a count of points: it also credits defensive play, deployment, and on-ice results that never show up as a point for the player. A player can put in a strong two-way game and record zero points, or pick up points in a blowout without doing much to help his team win. Splitting a season's WAR by point totals would move value into whichever games happened to produce points and out of the games where it was actually earned. Game Value approximates the same broader kind of on-ice value that WAR measures, built from goals for and against while a player is on the ice rather than from his own point totals, which makes it a much closer match for what is actually being split.</w:t>
+      </w:r>
+    </w:p>
+    <w:p>
+      <w:pPr>
+        <w:spacing w:after="200"/>
+        <w:jc w:val="left"/>
+      </w:pPr>
+      <w:r>
+        <w:t xml:space="preserve">Game Value's per-game numbers, tagged by team, are used to weight the split instead: a team gets the share of the season's Game Value that its games actually produced, and Bacon's season total is divided in that proportion.</w:t>
       </w:r>
     </w:p>
     <w:p>
@@ -134,25 +161,25 @@
         <w:jc w:val="left"/>
       </w:pPr>
       <w:r>
-        <w:t xml:space="preserve">The main test compares each player's trailing production figure, the same number the model prices him on, against how he actually performed that season according to the adjusted version of Game Value. Both sides are measured in wins, with no dollar conversion involved. Run across 6,027 player-seasons, the two measures agreed at a correlation of 0.576, and that held steady across each of the nine seasons in the sample: no single season and no shift in the league's style of play is driving the result. Testing the same comparison a year further out, projecting a player's production and checking it against his Game Value the following season, the agreement held nearly as well.</w:t>
-      </w:r>
-    </w:p>
-    <w:p>
-      <w:pPr>
-        <w:spacing w:after="200"/>
-        <w:jc w:val="left"/>
-      </w:pPr>
-      <w:r>
-        <w:t xml:space="preserve">A second version of the test used Game Value without the adjustment described above, scored two different ways: against a replacement-level baseline, meaning how much better a player was than a freely available replacement, and as a zero-sum split, meaning a team's whole output is divided up among its players with nothing left over. Both versions came out close to the main result, in the same 0.56 to 0.61 range, and held up the same way across all nine seasons and at the one-year-out horizon, weakening only slightly the further out the comparison reached. One thing worth flagging: the unadjusted version of Game Value matched or slightly beat the adjusted version. That is likely because the adjustment strips out some of the team-context signal described above, so removing it made the two measures look more alike, not less.</w:t>
-      </w:r>
-    </w:p>
-    <w:p>
-      <w:pPr>
-        <w:spacing w:after="200"/>
-        <w:jc w:val="left"/>
-      </w:pPr>
-      <w:r>
-        <w:t xml:space="preserve">The agreement splits by position the same way the earlier test did: strong for forwards, much weaker for defencemen. This is the same defensive-data gap described above, showing up again from the outcome side rather than the input side.</w:t>
+        <w:t xml:space="preserve">The main test compares each player's trailing production, the same number the market-rate regression converts into his dollar value, against how he actually performed that season according to the adjusted version of Game Value. Both sides are measured in wins. Run across 6,027 player-seasons, the two measures agreed at a correlation of 0.576, and that held steady across each of the nine seasons in the sample: no single season and no shift in the league's style of play is driving the result. Testing the same comparison a year further out, taking a player's trailing production and checking it against his Game Value the following season, the agreement held nearly as well.</w:t>
+      </w:r>
+    </w:p>
+    <w:p>
+      <w:pPr>
+        <w:spacing w:after="200"/>
+        <w:jc w:val="left"/>
+      </w:pPr>
+      <w:r>
+        <w:t xml:space="preserve">A second version of the test used Game Value without the adjustment described above, scored two different ways. The first measures each player against a replacement-level baseline, meaning how much better a player was than a freely available replacement, the same zero point Bacon's WAR uses. The second is a zero-sum split: instead of a replacement-level floor, each player is measured against his own team's average, so every player's share adds up to exactly the team's total value, no more and no less. Both versions came out close to the main result, in the same 0.56 to 0.61 range, and held up the same way across all nine seasons and at the one-year-out horizon, weakening only slightly the further out the comparison reached.</w:t>
+      </w:r>
+    </w:p>
+    <w:p>
+      <w:pPr>
+        <w:spacing w:after="200"/>
+        <w:jc w:val="left"/>
+      </w:pPr>
+      <w:r>
+        <w:t xml:space="preserve">The agreement is stronger for forwards than for defencemen, the same defensive-data gap described above showing up again from the outcome side rather than the input side. Any number pulled from this check for defencemen should sit closer to 0.30 than to the higher forward number. One planned extension of this test, using two additional variants of the unadjusted Game Value, was never run; that is a scope decision, not something that was missed.</w:t>
       </w:r>
     </w:p>
     <w:p>
@@ -170,7 +197,7 @@
         <w:jc w:val="left"/>
       </w:pPr>
       <w:r>
-        <w:t xml:space="preserve">This is convergent validity, not confirmation that the dollar value of a win is correct. Convergent validity means two independently built measures point in the same direction, which is different from proving either one is right. This test can only show that the model's projection tracks an independent measure of the same underlying performance. It says nothing about whether the market rate that turns wins into dollars is itself the correct rate.</w:t>
+        <w:t xml:space="preserve">This is not confirmation that the dollar value of a win is correct. Rather, it shows that these two independently built measures point in the same direction. This test can only show that the model's projection tracks an independent measure of the same underlying performance. It says nothing about whether the market rate that turns wins into dollars is itself the correct rate.</w:t>
       </w:r>
     </w:p>
     <w:p>
@@ -180,33 +207,6 @@
       </w:pPr>
       <w:r>
         <w:t xml:space="preserve">Bacon's WAR and Game Value share no model and no data source, but they describe the same underlying games. Two measures built completely separately can still agree in part simply because they are both trying to describe the same reality. The two are independent in method, not in what they are measuring.</w:t>
-      </w:r>
-    </w:p>
-    <w:p>
-      <w:pPr>
-        <w:pStyle w:val="Heading2"/>
-        <w:spacing w:after="140" w:before="280"/>
-      </w:pPr>
-      <w:r>
-        <w:t xml:space="preserve">Open and untested</w:t>
-      </w:r>
-    </w:p>
-    <w:p>
-      <w:pPr>
-        <w:spacing w:after="200"/>
-        <w:jc w:val="left"/>
-      </w:pPr>
-      <w:r>
-        <w:t xml:space="preserve">The gap between forwards and defencemen shows up on both sides of this check: Game Value explains skater value less well for defencemen to begin with, and the agreement in this test is weaker for defencemen too. Any number pulled from this check for defencemen should sit in the 0.28 to 0.30 range, not the higher forward number.</w:t>
-      </w:r>
-    </w:p>
-    <w:p>
-      <w:pPr>
-        <w:spacing w:after="200"/>
-        <w:jc w:val="left"/>
-      </w:pPr>
-      <w:r>
-        <w:t xml:space="preserve">One planned extra check, testing two additional variants of the unadjusted Game Value, was never run. That is a deliberate scope decision, not something that was missed.</w:t>
       </w:r>
     </w:p>
     <w:sectPr>

</xml_diff>

<commit_message>
Rewrite Doc 1's Game Value explanation from the actual scripts
Thomas: "It just says we take data and make number." Correct
diagnosis - the draft described Game Value as splitting credit for
actual goals scored. Reading the real pipeline (xg_model.py,
score_state.py, metric_assembly.py) shows it's built from expected
goals: a logistic-regression shot-quality score, adjusted for score
state, split among on-ice skaters, with a penalty layer on top.

This also fixes the explanation of why the season-level 58.3% check
isn't circular: the metric prices shot quality, not actual goals, so
checking it against real goal differential is a genuine outside test -
not, as previously written, that the adjustment weights "might be
estimated wrong."

Co-Authored-By: Claude Sonnet 5 <noreply@anthropic.com>
Claude-Session: https://claude.ai/code/session_01T6UzmRkyqYD2WcKRzWtaQa
</commit_message>
<xml_diff>
--- a/40_DOCS/Doc_1_Circularity_and_Game_Value.docx
+++ b/40_DOCS/Doc_1_Circularity_and_Game_Value.docx
@@ -62,16 +62,43 @@
         <w:jc w:val="left"/>
       </w:pPr>
       <w:r>
-        <w:t xml:space="preserve">Game Value is a second, independent measure of on-ice contribution, built from raw play-by-play data with zero Bacon inputs at any stage. For each goal, it splits credit for it, positive for the team that scored and negative for the team that allowed it, equally among the players who were on the ice, then adjusts that credit for the game situation: strength state, meaning whether a team was at even strength, on the power play, or shorthanded, and score state, meaning whether a team was leading, trailing, or tied, since teams play differently in each situation.</w:t>
-      </w:r>
-    </w:p>
-    <w:p>
-      <w:pPr>
-        <w:spacing w:after="200"/>
-        <w:jc w:val="left"/>
-      </w:pPr>
-      <w:r>
-        <w:t xml:space="preserve">The metric is built and validated on 11,870 games, from 2017-18 through 2025-26, and it is checked two different ways that answer two different questions. First, within any single game, the credit assigned to every player on the ice sums back exactly to that game's own goals for and against, with zero discrepancy across the full dataset. That is a bookkeeping check: it confirms the redistribution math has no bugs, not that the metric measures anything useful. Second, because the strength-state and score-state adjustments are estimated weights rather than a plain equal split, a team's Game Value added up across a full season does not have to match that team's actual season-long goal differential; small errors in those weights could compound across 82 games. Checking the two against each other is a real outside test of whether the weights are reasonable, and that check explains 58.3% of the actual variation in real goal differential across team-seasons. At the single-game level it explains only 3.4% of what happens in that one game, which sounds low until it is compared to a public benchmark: MoneyPuck, a reputable advanced hockey-analytics website, explains roughly 7% per game with a far more detailed model. A single game is mostly luck for any model.</w:t>
+        <w:t xml:space="preserve">Game Value starts from the NHL's own play-by-play data: every shot taken in a game, tagged with where it came from, what kind of shot it was, and the manpower situation; every penalty; and the full shift record showing exactly which skaters were on the ice for each of those events. Zero Bacon inputs at any stage.</w:t>
+      </w:r>
+    </w:p>
+    <w:p>
+      <w:pPr>
+        <w:spacing w:after="200"/>
+        <w:jc w:val="left"/>
+      </w:pPr>
+      <w:r>
+        <w:t xml:space="preserve">The first step turns each shot into a probability of becoming a goal, its expected-goals value, or xG. A shot from a bad angle far out might be worth 0.03 expected goals; a clean one-timer from the slot might be worth 0.25. This probability comes from a logistic regression, a standard statistical model that takes a shot's distance, angle, type, and manpower situation and returns a number between 0 and 1, fitted on the same play-by-play data.</w:t>
+      </w:r>
+    </w:p>
+    <w:p>
+      <w:pPr>
+        <w:spacing w:after="200"/>
+        <w:jc w:val="left"/>
+      </w:pPr>
+      <w:r>
+        <w:t xml:space="preserve">That expected-goals value is then adjusted for the score situation: strength state, meaning whether a team was at even strength, on the power play, or shorthanded, and score state, meaning whether it was leading, trailing, or tied. A team that is behind generates more shot volume because it is pressing, and a team that is ahead generates less because it is defending, so a chance created while trailing is worth slightly less than average and one created while leading is worth slightly more. This keeps neither scoreboard situation from looking artificially productive.</w:t>
+      </w:r>
+    </w:p>
+    <w:p>
+      <w:pPr>
+        <w:spacing w:after="200"/>
+        <w:jc w:val="left"/>
+      </w:pPr>
+      <w:r>
+        <w:t xml:space="preserve">That adjusted value is then split equally among the skaters who were actually on the ice for it: a positive share for each skater on the team that took the shot, a negative share of the same size for each skater on the team that allowed it. Penalties are added on top, separately: drawing a penalty credits a player with the league's own average net goal value of a power play, estimated from the gap between power-play goals and shorthanded goals across all penalties that actually created one; taking a penalty debits him the same amount. Add a player's on-ice total to his penalty total, for each game he played, and the result is Game Value: one number per skater per game, denominated in goals, saying how much that player's presence and penalty activity shifted the balance of scoring chances in his team's favor or against it.</w:t>
+      </w:r>
+    </w:p>
+    <w:p>
+      <w:pPr>
+        <w:spacing w:after="200"/>
+        <w:jc w:val="left"/>
+      </w:pPr>
+      <w:r>
+        <w:t xml:space="preserve">The metric is built and validated on 11,870 games, from 2017-18 through 2025-26, and it is checked two different ways that answer two different questions. First, because every chance's credit is a positive share for the attackers and an equal negative share for the defenders, adding up each player's on-ice number across the entire league comes to exactly zero. That is a bookkeeping check: it confirms the redistribution math has no bugs, not that the metric measures anything useful. Second, and this is the real test: Game Value is built from expected goals, meaning shot quality, not from the goals a team actually scored, so there is no guarantee that a team's players, summed up, will match what actually happened on the real scoreboard. Checking whether they do is a genuine outside test. At the single-game level the match is weak, explaining only 3.4% of that game's actual goal differential, because one game of hockey is mostly decided by finishing luck rather than chance quality; MoneyPuck, a reputable advanced hockey-analytics website with a richer model than this one, gets a comparable 7% at the single-game level, for the same reason. Summed across a full season, luck washes out and chance-quality differences compound, and the match is much stronger: 58.3% of real season-long goal differential, fitted to nothing.</w:t>
       </w:r>
     </w:p>
     <w:p>
@@ -134,7 +161,7 @@
         <w:jc w:val="left"/>
       </w:pPr>
       <w:r>
-        <w:t xml:space="preserve">Points could be used instead, since the data already shows which games a player's points came from, but points would misallocate this specific number. Bacon's WAR is not just a count of points: it also credits defensive play, deployment, and on-ice results that never show up as a point for the player. A player can put in a strong two-way game and record zero points, or pick up points in a blowout without doing much to help his team win. Splitting a season's WAR by point totals would move value into whichever games happened to produce points and out of the games where it was actually earned. Game Value approximates the same broader kind of on-ice value that WAR measures, built from goals for and against while a player is on the ice rather than from his own point totals, which makes it a much closer match for what is actually being split.</w:t>
+        <w:t xml:space="preserve">Points could be used instead, since the data already shows which games a player's points came from, but points would misallocate this specific number. Bacon's WAR is not just a count of points: it also credits defensive play, deployment, and on-ice results that never show up as a point for the player. A player can put in a strong two-way game and record zero points, or pick up points in a blowout without doing much to help his team win. Splitting a season's WAR by point totals would move value into whichever games happened to produce points and out of the games where it was actually earned. Game Value approximates the same broader kind of on-ice value that WAR measures, built from shot quality and penalties while a player is on the ice rather than from his own point totals, which makes it a much closer match for what is actually being split.</w:t>
       </w:r>
     </w:p>
     <w:p>
@@ -170,7 +197,7 @@
         <w:jc w:val="left"/>
       </w:pPr>
       <w:r>
-        <w:t xml:space="preserve">A second version of the test used Game Value without the adjustment described above, scored two different ways. The first measures each player against a replacement-level baseline, meaning how much better a player was than a freely available replacement, the same zero point Bacon's WAR uses. The second is a zero-sum split: instead of a replacement-level floor, each player is measured against his own team's average, so every player's share adds up to exactly the team's total value, no more and no less. Both versions came out close to the main result, in the same 0.56 to 0.61 range, and held up the same way across all nine seasons and at the one-year-out horizon, weakening only slightly the further out the comparison reached.</w:t>
+        <w:t xml:space="preserve">A second version of the test used Game Value without the adjustment described above, scored two different ways. The first measures each player against a replacement-level baseline, meaning how much better a player was than a freely available replacement, the same zero point Bacon's WAR uses. The second is a zero-sum split: instead of a replacement-level floor, each player is measured against his own team's average, so each player's share adds up to exactly the team's total value, no more and no less. Both versions came out close to the main result, in the same 0.56 to 0.61 range, and held up the same way across all nine seasons and at the one-year-out horizon, weakening only slightly the further out the comparison reached.</w:t>
       </w:r>
     </w:p>
     <w:p>

</xml_diff>

<commit_message>
Edit circularity explainer for clarity and record session
</commit_message>
<xml_diff>
--- a/40_DOCS/Doc_1_Circularity_and_Game_Value.docx
+++ b/40_DOCS/Doc_1_Circularity_and_Game_Value.docx
@@ -5,235 +5,462 @@
     <w:p>
       <w:pPr>
         <w:pStyle w:val="Title"/>
+        <w:keepNext/>
+        <w:widowControl/>
         <w:spacing w:after="240"/>
       </w:pPr>
       <w:r>
-        <w:t xml:space="preserve">Circularity and Game Value</w:t>
-      </w:r>
-    </w:p>
-    <w:p>
-      <w:pPr>
-        <w:spacing w:after="200"/>
-        <w:jc w:val="left"/>
-      </w:pPr>
-      <w:r>
-        <w:t xml:space="preserve">This document explains the independent check built to test the model's dollar-per-win conversion rate for circularity. That rate, covered in the pricing document, is built from real player contracts, priced using the same WAR numbers the model uses to value those players. A check built only from those same numbers would only prove the model agrees with itself. Game Value is the independent measure built to break that dependency.</w:t>
+        <w:rPr>
+          <w:rFonts w:ascii="Calibri" w:hAnsi="Calibri"/>
+          <w:b w:val="0"/>
+          <w:color w:val="000000"/>
+          <w:sz w:val="44"/>
+        </w:rPr>
+        <w:t>Circularity and Game Value</w:t>
+      </w:r>
+    </w:p>
+    <w:p>
+      <w:pPr>
+        <w:pStyle w:val="Normal"/>
+        <w:keepNext w:val="0"/>
+        <w:widowControl/>
+        <w:spacing w:after="200"/>
+        <w:jc w:val="left"/>
+      </w:pPr>
+      <w:r>
+        <w:rPr>
+          <w:rFonts w:ascii="Calibri" w:hAnsi="Calibri"/>
+          <w:b w:val="0"/>
+          <w:color w:val="000000"/>
+          <w:sz w:val="22"/>
+        </w:rPr>
+        <w:t>Game Value provides an independent check on the model's production estimates. It measures on-ice performance using NHL play-by-play and shift data, with no Bacon WAR inputs. The results support the estimates for forwards and offer more limited support for defencemen. They do not establish whether the model uses the correct dollar price of a win.</w:t>
       </w:r>
     </w:p>
     <w:p>
       <w:pPr>
         <w:pStyle w:val="Heading2"/>
+        <w:keepNext/>
+        <w:widowControl/>
         <w:spacing w:after="140" w:before="280"/>
       </w:pPr>
       <w:r>
-        <w:t xml:space="preserve">The problem</w:t>
-      </w:r>
-    </w:p>
-    <w:p>
-      <w:pPr>
-        <w:spacing w:after="200"/>
-        <w:jc w:val="left"/>
-      </w:pPr>
-      <w:r>
-        <w:t xml:space="preserve">Each player's dollar value in this model starts from a projected win total. The rate that turns those wins into dollars comes from real player contracts, and those contract prices already reflect Bacon's WAR. If the only available check on whether a projection looks right is also built from Bacon, the check always passes automatically, because it is comparing the model to itself. An outside measure was needed: something that predicts on-ice value without touching Bacon anywhere in its construction, so that agreement between the two would actually mean something.</w:t>
-      </w:r>
-    </w:p>
-    <w:p>
-      <w:pPr>
-        <w:spacing w:after="200"/>
-        <w:jc w:val="left"/>
-      </w:pPr>
-      <w:r>
-        <w:t xml:space="preserve">Two terms recur through the rest of this document, and it is worth being precise about them here. A player's trailing production is his trailing WAR: a weighted blend of his Bacon WAR from the seasons before the date being valued, covered in the baseline document. A player's projected production, used for future contract seasons, takes that trailing figure and runs it forward through an aging curve, covered in the projection document. The market-rate regression is what actually converts a player's trailing WAR into a dollar figure; that regression, not the trailing WAR itself, is the rate mentioned above, and it is built in the pricing document, not here.</w:t>
+        <w:rPr>
+          <w:rFonts w:ascii="Calibri" w:hAnsi="Calibri"/>
+          <w:b/>
+          <w:color w:val="000000"/>
+          <w:sz w:val="26"/>
+        </w:rPr>
+        <w:t>The circularity problem</w:t>
+      </w:r>
+    </w:p>
+    <w:p>
+      <w:pPr>
+        <w:pStyle w:val="Normal"/>
+        <w:keepNext w:val="0"/>
+        <w:widowControl/>
+        <w:spacing w:after="200"/>
+        <w:jc w:val="left"/>
+      </w:pPr>
+      <w:r>
+        <w:rPr>
+          <w:rFonts w:ascii="Calibri" w:hAnsi="Calibri"/>
+          <w:b w:val="0"/>
+          <w:color w:val="000000"/>
+          <w:sz w:val="22"/>
+        </w:rPr>
+        <w:t>The model estimates the price of a win by relating actual contract prices to players' Bacon WAR. It then uses that rate to put a dollar value on production. Checking the resulting valuations against another Bacon-based measure would leave both sides dependent on the same measure of performance. Agreement could reflect shared assumptions or errors. Game Value provides a separate benchmark for assessing the production estimate.</w:t>
+      </w:r>
+    </w:p>
+    <w:p>
+      <w:pPr>
+        <w:pStyle w:val="Normal"/>
+        <w:keepNext w:val="0"/>
+        <w:widowControl/>
+        <w:spacing w:after="200"/>
+        <w:jc w:val="left"/>
+      </w:pPr>
+      <w:r>
+        <w:rPr>
+          <w:rFonts w:ascii="Calibri" w:hAnsi="Calibri"/>
+          <w:b w:val="0"/>
+          <w:color w:val="000000"/>
+          <w:sz w:val="22"/>
+        </w:rPr>
+        <w:t>The distinction between trailing and projected production matters here. Trailing production is a weighted blend of a player's Bacon WAR from seasons before the valuation date, as explained in the baseline document. For future contract seasons, the model applies an aging curve to that figure, as explained in the projection document. The pricing document covers the market regression that converts production into dollars. The check here compares trailing production with subsequent performance; it does not test the dollar conversion itself.</w:t>
       </w:r>
     </w:p>
     <w:p>
       <w:pPr>
         <w:pStyle w:val="Heading2"/>
+        <w:keepNext/>
+        <w:widowControl/>
         <w:spacing w:after="140" w:before="280"/>
       </w:pPr>
       <w:r>
-        <w:t xml:space="preserve">What Game Value is</w:t>
-      </w:r>
-    </w:p>
-    <w:p>
-      <w:pPr>
-        <w:spacing w:after="200"/>
-        <w:jc w:val="left"/>
-      </w:pPr>
-      <w:r>
-        <w:t xml:space="preserve">Game Value starts from the NHL's own play-by-play data: every shot taken in a game, tagged with where it came from, what kind of shot it was, and the manpower situation; every penalty; and the full shift record showing exactly which skaters were on the ice for each of those events. Zero Bacon inputs at any stage.</w:t>
-      </w:r>
-    </w:p>
-    <w:p>
-      <w:pPr>
-        <w:spacing w:after="200"/>
-        <w:jc w:val="left"/>
-      </w:pPr>
-      <w:r>
-        <w:t xml:space="preserve">The first step turns each shot into a probability of becoming a goal, its expected-goals value, or xG. A shot from a bad angle far out might be worth 0.03 expected goals; a clean one-timer from the slot might be worth 0.25. This probability comes from a logistic regression, a standard statistical model that takes a shot's distance, angle, type, and manpower situation and returns a number between 0 and 1, fitted on the same play-by-play data.</w:t>
-      </w:r>
-    </w:p>
-    <w:p>
-      <w:pPr>
-        <w:spacing w:after="200"/>
-        <w:jc w:val="left"/>
-      </w:pPr>
-      <w:r>
-        <w:t xml:space="preserve">That expected-goals value is then adjusted for the score situation: strength state, meaning whether a team was at even strength, on the power play, or shorthanded, and score state, meaning whether it was leading, trailing, or tied. A team that is behind generates more shot volume because it is pressing, and a team that is ahead generates less because it is defending, so a chance created while trailing is worth slightly less than average and one created while leading is worth slightly more. This keeps neither scoreboard situation from looking artificially productive.</w:t>
-      </w:r>
-    </w:p>
-    <w:p>
-      <w:pPr>
-        <w:spacing w:after="200"/>
-        <w:jc w:val="left"/>
-      </w:pPr>
-      <w:r>
-        <w:t xml:space="preserve">That adjusted value is then split equally among the skaters who were actually on the ice for it: a positive share for each skater on the team that took the shot, a negative share of the same size for each skater on the team that allowed it. Penalties are added on top, separately: drawing a penalty credits a player with the league's own average net goal value of a power play, estimated from the gap between power-play goals and shorthanded goals across all penalties that actually created one; taking a penalty debits him the same amount. Add a player's on-ice total to his penalty total, for each game he played, and the result is Game Value: one number per skater per game, denominated in goals, saying how much that player's presence and penalty activity shifted the balance of scoring chances in his team's favor or against it.</w:t>
-      </w:r>
-    </w:p>
-    <w:p>
-      <w:pPr>
-        <w:spacing w:after="200"/>
-        <w:jc w:val="left"/>
-      </w:pPr>
-      <w:r>
-        <w:t xml:space="preserve">The metric is built and validated on 11,870 games, from 2017-18 through 2025-26, and it is checked two different ways that answer two different questions. First, because every chance's credit is a positive share for the attackers and an equal negative share for the defenders, adding up each player's on-ice number across the entire league comes to exactly zero. That is a bookkeeping check: it confirms the redistribution math has no bugs, not that the metric measures anything useful. Second, and this is the real test: Game Value is built from expected goals, meaning shot quality, not from the goals a team actually scored, so there is no guarantee that a team's players, summed up, will match what actually happened on the real scoreboard. Checking whether they do is a genuine outside test. At the single-game level the match is weak, explaining only 3.4% of that game's actual goal differential, because one game of hockey is mostly decided by finishing luck rather than chance quality; MoneyPuck, a reputable advanced hockey-analytics website with a richer model than this one, gets a comparable 7% at the single-game level, for the same reason. Summed across a full season, luck washes out and chance-quality differences compound, and the match is much stronger: 58.3% of real season-long goal differential, fitted to nothing.</w:t>
-      </w:r>
-    </w:p>
-    <w:p>
-      <w:pPr>
-        <w:spacing w:after="200"/>
-        <w:jc w:val="left"/>
-      </w:pPr>
-      <w:r>
-        <w:t xml:space="preserve">Game Value cannot tell a player apart from his own linemates: an equal split gives everyone on the ice the same credit, so it cannot separate a player who drove a shift from one who was just along for it. This is why Game Value is used for allocation and validation rather than as a standalone player value.</w:t>
+        <w:rPr>
+          <w:rFonts w:ascii="Calibri" w:hAnsi="Calibri"/>
+          <w:b/>
+          <w:color w:val="000000"/>
+          <w:sz w:val="26"/>
+        </w:rPr>
+        <w:t>How Game Value is calculated</w:t>
+      </w:r>
+    </w:p>
+    <w:p>
+      <w:pPr>
+        <w:pStyle w:val="Normal"/>
+        <w:keepNext w:val="0"/>
+        <w:widowControl/>
+        <w:spacing w:after="200"/>
+        <w:jc w:val="left"/>
+      </w:pPr>
+      <w:r>
+        <w:rPr>
+          <w:rFonts w:ascii="Calibri" w:hAnsi="Calibri"/>
+          <w:b w:val="0"/>
+          <w:color w:val="000000"/>
+          <w:sz w:val="22"/>
+        </w:rPr>
+        <w:t>Game Value uses the NHL's shot, penalty, and shift records. Shots are described by their location, type, and manpower situation. Shift records identify which skaters were on the ice when each event occurred.</w:t>
+      </w:r>
+    </w:p>
+    <w:p>
+      <w:pPr>
+        <w:pStyle w:val="Normal"/>
+        <w:keepNext w:val="0"/>
+        <w:widowControl/>
+        <w:spacing w:after="200"/>
+        <w:jc w:val="left"/>
+      </w:pPr>
+      <w:r>
+        <w:rPr>
+          <w:rFonts w:ascii="Calibri" w:hAnsi="Calibri"/>
+          <w:b w:val="0"/>
+          <w:color w:val="000000"/>
+          <w:sz w:val="22"/>
+        </w:rPr>
+        <w:t>Each shot receives an expected-goals value, or xG: its estimated probability of becoming a goal. A distant shot from a bad angle might have an xG of 0.03, meaning a 3% chance of scoring; a chance from the slot might have an xG of 0.25. These probabilities come from a logistic regression fitted to the play-by-play data. The model uses shot characteristics, including distance, angle, type, and manpower situation, to estimate a probability between zero and one.</w:t>
+      </w:r>
+    </w:p>
+    <w:p>
+      <w:pPr>
+        <w:pStyle w:val="Normal"/>
+        <w:keepNext w:val="0"/>
+        <w:widowControl/>
+        <w:spacing w:after="200"/>
+        <w:jc w:val="left"/>
+      </w:pPr>
+      <w:r>
+        <w:rPr>
+          <w:rFonts w:ascii="Calibri" w:hAnsi="Calibri"/>
+          <w:b w:val="0"/>
+          <w:color w:val="000000"/>
+          <w:sz w:val="22"/>
+        </w:rPr>
+        <w:t>The calculation also accounts for strength and score state. Strength state distinguishes even strength, power plays, and shorthanded play. Score state distinguishes teams that are leading, trailing, or tied. Trailing teams tend to press for goals and generate more shots, while leading teams tend to defend and generate fewer. At even strength, the score adjustment reduces the weight of chances created while trailing and increases it while leading, so these changes in approach do not distort the comparison.</w:t>
+      </w:r>
+    </w:p>
+    <w:p>
+      <w:pPr>
+        <w:pStyle w:val="Normal"/>
+        <w:keepNext w:val="0"/>
+        <w:widowControl/>
+        <w:spacing w:after="200"/>
+        <w:jc w:val="left"/>
+      </w:pPr>
+      <w:r>
+        <w:rPr>
+          <w:rFonts w:ascii="Calibri" w:hAnsi="Calibri"/>
+          <w:b w:val="0"/>
+          <w:color w:val="000000"/>
+          <w:sz w:val="22"/>
+        </w:rPr>
+        <w:t>Each adjusted chance is divided equally among the attacking skaters on the ice and charged equally to the defending skaters. The total credit and debit are equal, although the share per player differs when the teams have different numbers of skaters. Penalties are valued separately. Drawing a penalty earns the estimated net goal value of a power play; taking one incurs the same debit. That value is estimated from power-play goals minus shorthanded goals across penalties that produced a power play. A player's on-ice and penalty totals are added for each game. The result is Game Value, measured in goals.</w:t>
+      </w:r>
+    </w:p>
+    <w:p>
+      <w:pPr>
+        <w:pStyle w:val="Normal"/>
+        <w:keepNext w:val="0"/>
+        <w:widowControl/>
+        <w:spacing w:after="200"/>
+        <w:jc w:val="left"/>
+      </w:pPr>
+      <w:r>
+        <w:rPr>
+          <w:rFonts w:ascii="Calibri" w:hAnsi="Calibri"/>
+          <w:b w:val="0"/>
+          <w:color w:val="000000"/>
+          <w:sz w:val="22"/>
+        </w:rPr>
+        <w:t>The metric covers 11,870 games from 2017–18 through 2025–26. Two checks serve different purposes. First, the on-ice credits and debits sum to zero across the league. This checks the allocation arithmetic, but cannot establish whether the metric measures performance well. Second, team totals are compared with actual goal differential. Game Value explains 3.4% of the variation in goal differential between individual games, compared with about 7% for MoneyPuck's richer model. Individual results also depend on finishing, goaltending, and chance. Across full seasons, the relationship is stronger: Game Value explains 58.3% of the variation in team goal differential, without being fitted to those team-season results.</w:t>
+      </w:r>
+    </w:p>
+    <w:p>
+      <w:pPr>
+        <w:pStyle w:val="Normal"/>
+        <w:keepNext w:val="0"/>
+        <w:widowControl/>
+        <w:spacing w:after="200"/>
+        <w:jc w:val="left"/>
+      </w:pPr>
+      <w:r>
+        <w:rPr>
+          <w:rFonts w:ascii="Calibri" w:hAnsi="Calibri"/>
+          <w:b w:val="0"/>
+          <w:color w:val="000000"/>
+          <w:sz w:val="22"/>
+        </w:rPr>
+        <w:t>An equal split cannot distinguish a player who drove a shift from a linemate who contributed little. Raw Game Value therefore serves as an allocation measure and a validation benchmark, rather than a standalone estimate of individual player value.</w:t>
       </w:r>
     </w:p>
     <w:p>
       <w:pPr>
         <w:pStyle w:val="Heading2"/>
+        <w:keepNext/>
+        <w:widowControl/>
         <w:spacing w:after="140" w:before="280"/>
       </w:pPr>
       <w:r>
-        <w:t xml:space="preserve">Why use Bacon's WAR over Game Value?</w:t>
-      </w:r>
-    </w:p>
-    <w:p>
-      <w:pPr>
-        <w:spacing w:after="200"/>
-        <w:jc w:val="left"/>
-      </w:pPr>
-      <w:r>
-        <w:t xml:space="preserve">Before Game Value was scoped to its current, narrower roles, a test asked a bigger question: could an adjusted version of Game Value replace Bacon's WAR for valuing skaters outright. That adjusted version, called GV-adj, tries to isolate an individual player's contribution more precisely than the raw split above: it separates a player's performance from his teammates and the opponents he faced, discounts finishing ability that looks more like luck than skill, and accounts for how a coach deploys him, offensive minutes against defensive minutes, for example.</w:t>
-      </w:r>
-    </w:p>
-    <w:p>
-      <w:pPr>
-        <w:spacing w:after="200"/>
-        <w:jc w:val="left"/>
-      </w:pPr>
-      <w:r>
-        <w:t xml:space="preserve">For forwards, GV-adj recovered a substantial share of Bacon's explanatory power. For defencemen, it did not. Defensive value is disproportionately about preventing events from happening in the first place, and play-by-play data has very little to say about what a defenceman prevented, since a good defensive play often just looks like nothing happening at all.</w:t>
+        <w:rPr>
+          <w:rFonts w:ascii="Calibri" w:hAnsi="Calibri"/>
+          <w:b/>
+          <w:color w:val="000000"/>
+          <w:sz w:val="26"/>
+        </w:rPr>
+        <w:t>Why the model retains Bacon WAR</w:t>
+      </w:r>
+    </w:p>
+    <w:p>
+      <w:pPr>
+        <w:pStyle w:val="Normal"/>
+        <w:keepNext w:val="0"/>
+        <w:widowControl/>
+        <w:spacing w:after="200"/>
+        <w:jc w:val="left"/>
+      </w:pPr>
+      <w:r>
+        <w:rPr>
+          <w:rFonts w:ascii="Calibri" w:hAnsi="Calibri"/>
+          <w:b w:val="0"/>
+          <w:color w:val="000000"/>
+          <w:sz w:val="22"/>
+        </w:rPr>
+        <w:t>An adjusted version, GV-adj, was tested as a possible replacement for Bacon WAR. It attempts to separate a player's contribution from the effects of teammates and opponents, reduce the weight given to finishing that may reflect luck, and account for deployment, such as offensive and defensive usage.</w:t>
+      </w:r>
+    </w:p>
+    <w:p>
+      <w:pPr>
+        <w:pStyle w:val="Normal"/>
+        <w:keepNext w:val="0"/>
+        <w:widowControl/>
+        <w:spacing w:after="200"/>
+        <w:jc w:val="left"/>
+      </w:pPr>
+      <w:r>
+        <w:rPr>
+          <w:rFonts w:ascii="Calibri" w:hAnsi="Calibri"/>
+          <w:b w:val="0"/>
+          <w:color w:val="000000"/>
+          <w:sz w:val="22"/>
+        </w:rPr>
+        <w:t>GV-adj recovered a substantial share of Bacon's explanatory power for forwards, but performed poorly for defencemen. This is consistent with a limitation of play-by-play data: much of defensive value comes from preventing chances, and an event record offers limited evidence about chances that never developed. The model therefore retains Bacon WAR for skater valuation.</w:t>
       </w:r>
     </w:p>
     <w:p>
       <w:pPr>
         <w:pStyle w:val="Heading2"/>
+        <w:keepNext/>
+        <w:widowControl/>
         <w:spacing w:after="140" w:before="280"/>
       </w:pPr>
       <w:r>
-        <w:t xml:space="preserve">Mid-season allocation</w:t>
-      </w:r>
-    </w:p>
-    <w:p>
-      <w:pPr>
-        <w:spacing w:after="200"/>
-        <w:jc w:val="left"/>
-      </w:pPr>
-      <w:r>
-        <w:t xml:space="preserve">A player traded partway through a season has one cumulative Bacon WAR figure for the full year, and the model needs to know how much of that value belonged to each team. Splitting by games played would treat every game as equally valuable, and that is not true: a player can be far more productive in one stretch of a season than another.</w:t>
-      </w:r>
-    </w:p>
-    <w:p>
-      <w:pPr>
-        <w:spacing w:after="200"/>
-        <w:jc w:val="left"/>
-      </w:pPr>
-      <w:r>
-        <w:t xml:space="preserve">Points could be used instead, since the data already shows which games a player's points came from, but points would misallocate this specific number. Bacon's WAR is not just a count of points: it also credits defensive play, deployment, and on-ice results that never show up as a point for the player. A player can put in a strong two-way game and record zero points, or pick up points in a blowout without doing much to help his team win. Splitting a season's WAR by point totals would move value into whichever games happened to produce points and out of the games where it was actually earned. Game Value approximates the same broader kind of on-ice value that WAR measures, built from shot quality and penalties while a player is on the ice rather than from his own point totals, which makes it a much closer match for what is actually being split.</w:t>
-      </w:r>
-    </w:p>
-    <w:p>
-      <w:pPr>
-        <w:spacing w:after="200"/>
-        <w:jc w:val="left"/>
-      </w:pPr>
-      <w:r>
-        <w:t xml:space="preserve">Game Value's per-game numbers, tagged by team, are used to weight the split instead: a team gets the share of the season's Game Value that its games actually produced, and Bacon's season total is divided in that proportion.</w:t>
+        <w:rPr>
+          <w:rFonts w:ascii="Calibri" w:hAnsi="Calibri"/>
+          <w:b/>
+          <w:color w:val="000000"/>
+          <w:sz w:val="26"/>
+        </w:rPr>
+        <w:t>Allocating value after a midseason trade</w:t>
+      </w:r>
+    </w:p>
+    <w:p>
+      <w:pPr>
+        <w:pStyle w:val="Normal"/>
+        <w:keepNext w:val="0"/>
+        <w:widowControl/>
+        <w:spacing w:after="200"/>
+        <w:jc w:val="left"/>
+      </w:pPr>
+      <w:r>
+        <w:rPr>
+          <w:rFonts w:ascii="Calibri" w:hAnsi="Calibri"/>
+          <w:b w:val="0"/>
+          <w:color w:val="000000"/>
+          <w:sz w:val="22"/>
+        </w:rPr>
+        <w:t>For a player traded during the season, the model must divide his full-season Bacon WAR between teams. A split based on games played assumes he contributed equally in every game, even if his performance changed after the trade.</w:t>
+      </w:r>
+    </w:p>
+    <w:p>
+      <w:pPr>
+        <w:pStyle w:val="Normal"/>
+        <w:keepNext w:val="0"/>
+        <w:widowControl/>
+        <w:spacing w:after="200"/>
+        <w:jc w:val="left"/>
+      </w:pPr>
+      <w:r>
+        <w:rPr>
+          <w:rFonts w:ascii="Calibri" w:hAnsi="Calibri"/>
+          <w:b w:val="0"/>
+          <w:color w:val="000000"/>
+          <w:sz w:val="22"/>
+        </w:rPr>
+        <w:t>Points offer more detail, but capture only part of what WAR measures. Defensive play and on-ice contributions can produce value without a point for the player. Dividing WAR by points would assign too much weight to games in which he scored and too little to contributions outside the scoresheet. Game Value uses shot quality and penalties to capture a broader share of that performance.</w:t>
+      </w:r>
+    </w:p>
+    <w:p>
+      <w:pPr>
+        <w:pStyle w:val="Normal"/>
+        <w:keepNext w:val="0"/>
+        <w:widowControl/>
+        <w:spacing w:after="200"/>
+        <w:jc w:val="left"/>
+      </w:pPr>
+      <w:r>
+        <w:rPr>
+          <w:rFonts w:ascii="Calibri" w:hAnsi="Calibri"/>
+          <w:b w:val="0"/>
+          <w:color w:val="000000"/>
+          <w:sz w:val="22"/>
+        </w:rPr>
+        <w:t>Game Value supplies a performance-based weight for the split. Its game records identify the team, allowing each stint's share of the season total to be calculated. Bacon's full-season WAR is then divided in those proportions. Game Value determines the allocation; Bacon still supplies the amount being allocated.</w:t>
       </w:r>
     </w:p>
     <w:p>
       <w:pPr>
         <w:pStyle w:val="Heading2"/>
+        <w:keepNext/>
+        <w:widowControl/>
         <w:spacing w:after="140" w:before="280"/>
       </w:pPr>
       <w:r>
-        <w:t xml:space="preserve">The circularity check</w:t>
-      </w:r>
-    </w:p>
-    <w:p>
-      <w:pPr>
-        <w:spacing w:after="200"/>
-        <w:jc w:val="left"/>
-      </w:pPr>
-      <w:r>
-        <w:t xml:space="preserve">The main test compares each player's trailing production, the same number the market-rate regression converts into his dollar value, against how he actually performed that season according to the adjusted version of Game Value. Both sides are measured in wins. Run across 6,027 player-seasons, the two measures agreed at a correlation of 0.576, and that held steady across each of the nine seasons in the sample: no single season and no shift in the league's style of play is driving the result. Testing the same comparison a year further out, taking a player's trailing production and checking it against his Game Value the following season, the agreement held nearly as well.</w:t>
-      </w:r>
-    </w:p>
-    <w:p>
-      <w:pPr>
-        <w:spacing w:after="200"/>
-        <w:jc w:val="left"/>
-      </w:pPr>
-      <w:r>
-        <w:t xml:space="preserve">A second version of the test used Game Value without the adjustment described above, scored two different ways. The first measures each player against a replacement-level baseline, meaning how much better a player was than a freely available replacement, the same zero point Bacon's WAR uses. The second is a zero-sum split: instead of a replacement-level floor, each player is measured against his own team's average, so each player's share adds up to exactly the team's total value, no more and no less. Both versions came out close to the main result, in the same 0.56 to 0.61 range, and held up the same way across all nine seasons and at the one-year-out horizon, weakening only slightly the further out the comparison reached.</w:t>
-      </w:r>
-    </w:p>
-    <w:p>
-      <w:pPr>
-        <w:spacing w:after="200"/>
-        <w:jc w:val="left"/>
-      </w:pPr>
-      <w:r>
-        <w:t xml:space="preserve">The agreement is stronger for forwards than for defencemen, the same defensive-data gap described above showing up again from the outcome side rather than the input side. Any number pulled from this check for defencemen should sit closer to 0.30 than to the higher forward number. One planned extension of this test, using two additional variants of the unadjusted Game Value, was never run; that is a scope decision, not something that was missed.</w:t>
+        <w:rPr>
+          <w:rFonts w:ascii="Calibri" w:hAnsi="Calibri"/>
+          <w:b/>
+          <w:color w:val="000000"/>
+          <w:sz w:val="26"/>
+        </w:rPr>
+        <w:t>Results of the circularity check</w:t>
+      </w:r>
+    </w:p>
+    <w:p>
+      <w:pPr>
+        <w:pStyle w:val="Normal"/>
+        <w:keepNext w:val="0"/>
+        <w:widowControl/>
+        <w:spacing w:after="200"/>
+        <w:jc w:val="left"/>
+      </w:pPr>
+      <w:r>
+        <w:rPr>
+          <w:rFonts w:ascii="Calibri" w:hAnsi="Calibri"/>
+          <w:b w:val="0"/>
+          <w:color w:val="000000"/>
+          <w:sz w:val="22"/>
+        </w:rPr>
+        <w:t>The main check compares each player's trailing WAR, calculated before the season, with his performance that season according to GV-adj. Both are measured in wins, with no dollar conversion on the outcome side. Across 6,027 player-seasons, the correlation was 0.576. It ranged from 0.55 to 0.61 in each of the nine seasons, suggesting that no single season drove the result. Comparing the same trailing estimate with performance one season further ahead gave a correlation of 0.538.</w:t>
+      </w:r>
+    </w:p>
+    <w:p>
+      <w:pPr>
+        <w:pStyle w:val="Normal"/>
+        <w:keepNext w:val="0"/>
+        <w:widowControl/>
+        <w:spacing w:after="200"/>
+        <w:jc w:val="left"/>
+      </w:pPr>
+      <w:r>
+        <w:rPr>
+          <w:rFonts w:ascii="Calibri" w:hAnsi="Calibri"/>
+          <w:b w:val="0"/>
+          <w:color w:val="000000"/>
+          <w:sz w:val="22"/>
+        </w:rPr>
+        <w:t>Two checks used raw Game Value. One measured performance above a replacement-level baseline, the reference point used by Bacon WAR. The other retained the zero-sum allocation, in which player contributions sum to the team's total. Their correlations with trailing WAR were 0.609 and 0.564, respectively, close to the main result. Both were stable across seasons and weakened only slightly at the later horizon.</w:t>
+      </w:r>
+    </w:p>
+    <w:p>
+      <w:pPr>
+        <w:pStyle w:val="Normal"/>
+        <w:keepNext w:val="0"/>
+        <w:widowControl/>
+        <w:spacing w:after="200"/>
+        <w:jc w:val="left"/>
+      </w:pPr>
+      <w:r>
+        <w:rPr>
+          <w:rFonts w:ascii="Calibri" w:hAnsi="Calibri"/>
+          <w:b w:val="0"/>
+          <w:color w:val="000000"/>
+          <w:sz w:val="22"/>
+        </w:rPr>
+        <w:t>The main result was stronger for forwards, at 0.648, than for defencemen, at 0.302. That difference must accompany the pooled figure: the evidence for defencemen is limited. The replacement-based raw variant gave a higher defensive correlation, but its construction can inflate that figure, so it should not replace the main defensive result. The unrun raw Game Value extensions concern the separate contract-length test. The circularity checks described here are complete.</w:t>
       </w:r>
     </w:p>
     <w:p>
       <w:pPr>
         <w:pStyle w:val="Heading2"/>
+        <w:keepNext/>
+        <w:widowControl/>
         <w:spacing w:after="140" w:before="280"/>
       </w:pPr>
       <w:r>
-        <w:t xml:space="preserve">What this does not prove</w:t>
-      </w:r>
-    </w:p>
-    <w:p>
-      <w:pPr>
-        <w:spacing w:after="200"/>
-        <w:jc w:val="left"/>
-      </w:pPr>
-      <w:r>
-        <w:t xml:space="preserve">This is not confirmation that the dollar value of a win is correct. Rather, it shows that these two independently built measures point in the same direction. This test can only show that the model's projection tracks an independent measure of the same underlying performance. It says nothing about whether the market rate that turns wins into dollars is itself the correct rate.</w:t>
-      </w:r>
-    </w:p>
-    <w:p>
-      <w:pPr>
-        <w:spacing w:after="200"/>
-        <w:jc w:val="left"/>
-      </w:pPr>
-      <w:r>
-        <w:t xml:space="preserve">Bacon's WAR and Game Value share no model and no data source, but they describe the same underlying games. Two measures built completely separately can still agree in part simply because they are both trying to describe the same reality. The two are independent in method, not in what they are measuring.</w:t>
+        <w:rPr>
+          <w:rFonts w:ascii="Calibri" w:hAnsi="Calibri"/>
+          <w:b/>
+          <w:color w:val="000000"/>
+          <w:sz w:val="26"/>
+        </w:rPr>
+        <w:t>What the results establish</w:t>
+      </w:r>
+    </w:p>
+    <w:p>
+      <w:pPr>
+        <w:pStyle w:val="Normal"/>
+        <w:keepNext w:val="0"/>
+        <w:widowControl/>
+        <w:spacing w:after="200"/>
+        <w:jc w:val="left"/>
+      </w:pPr>
+      <w:r>
+        <w:rPr>
+          <w:rFonts w:ascii="Calibri" w:hAnsi="Calibri"/>
+          <w:b w:val="0"/>
+          <w:color w:val="000000"/>
+          <w:sz w:val="22"/>
+        </w:rPr>
+        <w:t>The results show that the model's trailing production estimate tracks a separately constructed measure of subsequent performance. This is evidence of convergent validity: two ways of measuring performance give broadly consistent results. No pass-or-fail threshold was set in advance, so the correlations are reported descriptively. Because the comparison is in wins, it cannot establish the correct dollar value of a win or show that contracts are mispriced.</w:t>
+      </w:r>
+    </w:p>
+    <w:p>
+      <w:pPr>
+        <w:pStyle w:val="Normal"/>
+        <w:keepNext w:val="0"/>
+        <w:widowControl/>
+        <w:spacing w:after="200"/>
+        <w:jc w:val="left"/>
+      </w:pPr>
+      <w:r>
+        <w:rPr>
+          <w:rFonts w:ascii="Calibri" w:hAnsi="Calibri"/>
+          <w:b w:val="0"/>
+          <w:color w:val="000000"/>
+          <w:sz w:val="22"/>
+        </w:rPr>
+        <w:t>Game Value uses no Bacon inputs and shares no valuation model with Bacon WAR. Both measures nevertheless describe the same underlying hockey games. Their agreement is useful evidence, but their separate construction does not make them independent observations of reality.</w:t>
       </w:r>
     </w:p>
     <w:sectPr>
@@ -431,6 +658,7 @@
     <w:next w:val="Normal"/>
     <w:qFormat/>
     <w:rPr>
+      <w:color w:val="000000"/>
       <w:sz w:val="56"/>
       <w:szCs w:val="56"/>
     </w:rPr>
@@ -452,7 +680,7 @@
     <w:next w:val="Normal"/>
     <w:qFormat/>
     <w:rPr>
-      <w:color w:val="2E74B5"/>
+      <w:color w:val="000000"/>
       <w:sz w:val="26"/>
       <w:szCs w:val="26"/>
     </w:rPr>
@@ -596,5 +824,11 @@
       <w:szCs w:val="20"/>
     </w:rPr>
   </w:style>
+  <w:style w:type="paragraph" w:customStyle="1" w:styleId="Normal">
+    <w:name w:val="Normal"/>
+    <w:rPr>
+      <w:color w:val="000000"/>
+    </w:rPr>
+  </w:style>
 </w:styles>
 </file>
</xml_diff>

<commit_message>
Restore benchmark context and clarify circularity comparison units
</commit_message>
<xml_diff>
--- a/40_DOCS/Doc_1_Circularity_and_Game_Value.docx
+++ b/40_DOCS/Doc_1_Circularity_and_Game_Value.docx
@@ -26,7 +26,7 @@
           <w:rFonts w:ascii="Calibri" w:hAnsi="Calibri"/>
           <w:sz w:val="22"/>
         </w:rPr>
-        <w:t>Game Value provides an independent check on the model’s production estimates. It measures on-ice performance using NHL play-by-play and shift data, with no Bacon WAR inputs. The two measures agree more closely for forwards than for defencemen. That agreement does not establish the correct dollar price of a win.</w:t>
+        <w:t>Game Value provides an independent check on the model’s production estimates. It measures on-ice performance using NHL play-by-play and shift data, with no Bacon WAR inputs. The two measures agree more closely for forwards than for defencemen. The comparison does not tell us what a win should cost.</w:t>
       </w:r>
     </w:p>
     <w:p>
@@ -53,7 +53,7 @@
           <w:rFonts w:ascii="Calibri" w:hAnsi="Calibri"/>
           <w:sz w:val="22"/>
         </w:rPr>
-        <w:t>The model estimates the price of a win by relating actual contract prices to players' Bacon WAR. It then uses that rate to put a dollar value on production. Checking the resulting valuations against another Bacon-based measure would leave both sides dependent on the same measure of performance. Agreement could reflect shared assumptions or errors. Game Value provides a separate benchmark for assessing the production estimate.</w:t>
+        <w:t>The model estimates the price of a win from actual contract prices and players’ Bacon WAR. It then uses that rate to put a dollar value on production. Checking those valuations against another Bacon-based measure would leave both sides dependent on the same measure of performance. They could agree partly because they share assumptions or errors. Game Value provides a separate check on the production estimate.</w:t>
       </w:r>
     </w:p>
     <w:p>
@@ -158,33 +158,46 @@
           <w:rFonts w:ascii="Calibri" w:hAnsi="Calibri"/>
           <w:sz w:val="22"/>
         </w:rPr>
-        <w:t>The metric covers 11,870 games from 2017–18 through 2025–26. Across the league, the on-ice credits and debits sum to zero. This checks the allocation math, but says nothing about whether the metric measures performance well.</w:t>
-      </w:r>
-    </w:p>
-    <w:p>
-      <w:pPr>
-        <w:pStyle w:val="Normal1"/>
-        <w:spacing w:after="200"/>
-      </w:pPr>
-      <w:r>
-        <w:rPr>
-          <w:rFonts w:ascii="Calibri" w:hAnsi="Calibri"/>
-          <w:sz w:val="22"/>
-        </w:rPr>
-        <w:t>The second check compares team Game Value with actual goal differential. Game Value assigns credit for expected goals, so a good chance contributes value even when the shot misses or is saved. The scoreboard records only goals that went in. A team can therefore generate more Game Value and still lose, and agreement between the two is not guaranteed by the allocation formula. Game Value explains 3.4% of the variation in goal differential between individual games. Across full seasons, when finishing, goaltending, and chance have more time to average out, it explains 58.3%.</w:t>
-      </w:r>
-    </w:p>
-    <w:p>
-      <w:pPr>
-        <w:pStyle w:val="Normal1"/>
-        <w:spacing w:after="200"/>
-      </w:pPr>
-      <w:r>
-        <w:rPr>
-          <w:rFonts w:ascii="Calibri" w:hAnsi="Calibri"/>
-          <w:sz w:val="22"/>
-        </w:rPr>
-        <w:t>This comparison is informative, but it is not a test on wholly unseen games. The shot model was initially tested on later seasons, then refitted on all regular-season data to produce the final Game Value inputs. The team-season result describes agreement within that historical sample.</w:t>
+        <w:t>The metric covers 11,870 games from 2017-18 through 2025-26. Across the league, the on-ice credits and debits sum to zero. This checks the allocation math, but says nothing about whether the metric measures performance well.</w:t>
+      </w:r>
+    </w:p>
+    <w:p>
+      <w:pPr>
+        <w:pStyle w:val="Normal1"/>
+        <w:spacing w:after="200"/>
+      </w:pPr>
+      <w:r>
+        <w:rPr>
+          <w:rFonts w:ascii="Calibri" w:hAnsi="Calibri"/>
+          <w:sz w:val="22"/>
+        </w:rPr>
+        <w:t>The second check compares team Game Value with actual goal differential. Game Value assigns credit for expected goals, so a good chance contributes value even when the shot misses or is saved. The scoreboard records only goals that went in. A team can therefore generate more Game Value and still lose, and agreement between the two is not guaranteed by the allocation formula.</w:t>
+      </w:r>
+    </w:p>
+    <w:p>
+      <w:pPr>
+        <w:pStyle w:val="Normal1"/>
+        <w:spacing w:after="200"/>
+      </w:pPr>
+      <w:r>
+        <w:rPr>
+          <w:rFonts w:ascii="Calibri" w:hAnsi="Calibri"/>
+          <w:sz w:val="22"/>
+        </w:rPr>
+        <w:t>Game Value explains 3.4% of the variation in goal differential between individual games. For context, a development check using MoneyPuck’s 2023-24 shot files found that team-game expected goals explained about 7% of the variation in goals scored. The outcome and sample differ from the Game Value check, so this is a reference point rather than a direct comparison. It also shows that a low single-game figure is not unique to this model. Across full seasons, Game Value explains 58.3% of the variation in team goal differential.</w:t>
+      </w:r>
+    </w:p>
+    <w:p>
+      <w:pPr>
+        <w:pStyle w:val="Normal1"/>
+        <w:spacing w:after="200"/>
+      </w:pPr>
+      <w:r>
+        <w:rPr>
+          <w:rFonts w:ascii="Calibri" w:hAnsi="Calibri"/>
+          <w:sz w:val="22"/>
+        </w:rPr>
+        <w:t>The shot model was initially tested on later seasons it had not seen, then refitted on all regular-season data to produce the final Game Value inputs. The 58.3% result therefore describes agreement within that historical sample. It is not a test on wholly unseen games.</w:t>
       </w:r>
     </w:p>
     <w:p>
@@ -237,7 +250,7 @@
           <w:rFonts w:ascii="Calibri" w:hAnsi="Calibri"/>
           <w:sz w:val="22"/>
         </w:rPr>
-        <w:t>GV-adj recovered a substantial share of Bacon’s explanatory power for forwards, but performed poorly for defencemen. Play-by-play data offer limited information about defensive contributions that prevent chances from developing, which may explain part of the gap. The comparison cannot establish which metric measures defensive value more accurately. The model retains Bacon WAR for skater valuation.</w:t>
+        <w:t>GV-adj came closer to Bacon’s results for forwards than for defencemen. Play-by-play data offer limited information about defensive contributions that prevent chances from developing, which may explain part of the gap. The comparison cannot tell us which metric measures defensive value more accurately. The model retains Bacon WAR for skater valuation.</w:t>
       </w:r>
     </w:p>
     <w:p>
@@ -317,7 +330,7 @@
           <w:rFonts w:ascii="Calibri" w:hAnsi="Calibri"/>
           <w:sz w:val="22"/>
         </w:rPr>
-        <w:t>The main check compares each player's trailing WAR, calculated before the season, with his performance that season according to GV-adj. Across 6,027 player-seasons, the correlation was 0.576. It ranged from 0.55 to 0.61 in each of the nine seasons, suggesting that no single season drove the result. Comparing the same trailing estimate with performance one season further ahead gave a correlation of 0.538.</w:t>
+        <w:t>The main check compares each player’s trailing WAR, calculated before the season, with his performance that season according to GV-adj. Both sides are measured in wins: Bacon WAR is already in win units, and GV-adj is converted from goals to wins. No dollar price enters the comparison. Across 6,027 player-seasons, the correlation was 0.576. It ranged from 0.55 to 0.61 in each of the nine seasons, suggesting that no single season drove the result. Comparing the same trailing estimate with performance one season further ahead gave a correlation of 0.538.</w:t>
       </w:r>
     </w:p>
     <w:p>
@@ -343,7 +356,7 @@
           <w:rFonts w:ascii="Calibri" w:hAnsi="Calibri"/>
           <w:sz w:val="22"/>
         </w:rPr>
-        <w:t>The main correlation was 0.648 for forwards and 0.302 for defencemen. The replacement-based raw variant gave a higher defensive correlation of 0.442, but the rebase can inflate that figure. The other two versions put the defensive correlation closer to 0.28–0.30.</w:t>
+        <w:t>The main correlation was 0.648 for forwards and 0.302 for defencemen. The replacement-based raw variant gave a higher defensive correlation of 0.442, but the rebase can inflate that figure. The other two versions put the defensive correlation closer to 0.28-0.30.</w:t>
       </w:r>
     </w:p>
     <w:p>
@@ -370,20 +383,20 @@
           <w:rFonts w:ascii="Calibri" w:hAnsi="Calibri"/>
           <w:sz w:val="22"/>
         </w:rPr>
-        <w:t>The check shows that the model’s trailing production estimate tracks a separately constructed measure of subsequent performance, particularly for forwards. It does not establish the correct dollar price of a win or show that contracts are mispriced. The market rate that converts production into dollars requires a separate assessment.</w:t>
-      </w:r>
-    </w:p>
-    <w:p>
-      <w:pPr>
-        <w:pStyle w:val="Normal1"/>
-        <w:spacing w:after="200"/>
-      </w:pPr>
-      <w:r>
-        <w:rPr>
-          <w:rFonts w:ascii="Calibri" w:hAnsi="Calibri"/>
-          <w:sz w:val="22"/>
-        </w:rPr>
-        <w:t>Game Value uses no Bacon inputs and shares no valuation model with Bacon WAR. Both measures nevertheless describe the same underlying games. Their agreement is useful evidence, but separate construction does not make them independent observations of performance.</w:t>
+        <w:t>Players with higher trailing WAR generally went on to produce more Game Value, particularly among forwards. That gives some support to the model’s starting estimate of production. It does not tell us whether the price attached to that production is right or whether contracts are mispriced.</w:t>
+      </w:r>
+    </w:p>
+    <w:p>
+      <w:pPr>
+        <w:pStyle w:val="Normal1"/>
+        <w:spacing w:after="200"/>
+      </w:pPr>
+      <w:r>
+        <w:rPr>
+          <w:rFonts w:ascii="Calibri" w:hAnsi="Calibri"/>
+          <w:sz w:val="22"/>
+        </w:rPr>
+        <w:t>Game Value uses no Bacon inputs and shares no valuation model with Bacon WAR. Both measures nevertheless describe the same games. They are built differently, but some agreement is expected because they are measuring the same players’ performances.</w:t>
       </w:r>
     </w:p>
     <w:sectPr>

</xml_diff>